<commit_message>
ms revised with heat and flooding
</commit_message>
<xml_diff>
--- a/doc/template.docx
+++ b/doc/template.docx
@@ -1,6 +1,6 @@
 
 <file path=word/document.xml><?xml version="1.0" encoding="utf-8"?>
-<w:document xmlns:wpc="http://schemas.microsoft.com/office/word/2010/wordprocessingCanvas" xmlns:cx="http://schemas.microsoft.com/office/drawing/2014/chartex" xmlns:cx1="http://schemas.microsoft.com/office/drawing/2015/9/8/chartex" xmlns:cx2="http://schemas.microsoft.com/office/drawing/2015/10/21/chartex" xmlns:cx3="http://schemas.microsoft.com/office/drawing/2016/5/9/chartex" xmlns:cx4="http://schemas.microsoft.com/office/drawing/2016/5/10/chartex" xmlns:cx5="http://schemas.microsoft.com/office/drawing/2016/5/11/chartex" xmlns:cx6="http://schemas.microsoft.com/office/drawing/2016/5/12/chartex" xmlns:cx7="http://schemas.microsoft.com/office/drawing/2016/5/13/chartex" xmlns:cx8="http://schemas.microsoft.com/office/drawing/2016/5/14/chartex" xmlns:mc="http://schemas.openxmlformats.org/markup-compatibility/2006" xmlns:aink="http://schemas.microsoft.com/office/drawing/2016/ink" xmlns:am3d="http://schemas.microsoft.com/office/drawing/2017/model3d" xmlns:o="urn:schemas-microsoft-com:office:office" xmlns:r="http://schemas.openxmlformats.org/officeDocument/2006/relationships" xmlns:m="http://schemas.openxmlformats.org/officeDocument/2006/math" xmlns:v="urn:schemas-microsoft-com:vml" xmlns:wp14="http://schemas.microsoft.com/office/word/2010/wordprocessingDrawing" xmlns:wp="http://schemas.openxmlformats.org/drawingml/2006/wordprocessingDrawing" xmlns:w10="urn:schemas-microsoft-com:office:word" xmlns:w="http://schemas.openxmlformats.org/wordprocessingml/2006/main" xmlns:w14="http://schemas.microsoft.com/office/word/2010/wordml" xmlns:w15="http://schemas.microsoft.com/office/word/2012/wordml" xmlns:w16cex="http://schemas.microsoft.com/office/word/2018/wordml/cex" xmlns:w16cid="http://schemas.microsoft.com/office/word/2016/wordml/cid" xmlns:w16="http://schemas.microsoft.com/office/word/2018/wordml" xmlns:w16sdtdh="http://schemas.microsoft.com/office/word/2020/wordml/sdtdatahash" xmlns:w16se="http://schemas.microsoft.com/office/word/2015/wordml/symex" xmlns:wpg="http://schemas.microsoft.com/office/word/2010/wordprocessingGroup" xmlns:wpi="http://schemas.microsoft.com/office/word/2010/wordprocessingInk" xmlns:wne="http://schemas.microsoft.com/office/word/2006/wordml" xmlns:wps="http://schemas.microsoft.com/office/word/2010/wordprocessingShape" mc:Ignorable="w14 w15 w16se w16cid w16 w16cex w16sdtdh wp14">
+<w:document xmlns:wpc="http://schemas.microsoft.com/office/word/2010/wordprocessingCanvas" xmlns:cx="http://schemas.microsoft.com/office/drawing/2014/chartex" xmlns:cx1="http://schemas.microsoft.com/office/drawing/2015/9/8/chartex" xmlns:cx2="http://schemas.microsoft.com/office/drawing/2015/10/21/chartex" xmlns:cx3="http://schemas.microsoft.com/office/drawing/2016/5/9/chartex" xmlns:cx4="http://schemas.microsoft.com/office/drawing/2016/5/10/chartex" xmlns:cx5="http://schemas.microsoft.com/office/drawing/2016/5/11/chartex" xmlns:cx6="http://schemas.microsoft.com/office/drawing/2016/5/12/chartex" xmlns:cx7="http://schemas.microsoft.com/office/drawing/2016/5/13/chartex" xmlns:cx8="http://schemas.microsoft.com/office/drawing/2016/5/14/chartex" xmlns:mc="http://schemas.openxmlformats.org/markup-compatibility/2006" xmlns:aink="http://schemas.microsoft.com/office/drawing/2016/ink" xmlns:am3d="http://schemas.microsoft.com/office/drawing/2017/model3d" xmlns:o="urn:schemas-microsoft-com:office:office" xmlns:oel="http://schemas.microsoft.com/office/2019/extlst" xmlns:r="http://schemas.openxmlformats.org/officeDocument/2006/relationships" xmlns:m="http://schemas.openxmlformats.org/officeDocument/2006/math" xmlns:v="urn:schemas-microsoft-com:vml" xmlns:wp14="http://schemas.microsoft.com/office/word/2010/wordprocessingDrawing" xmlns:wp="http://schemas.openxmlformats.org/drawingml/2006/wordprocessingDrawing" xmlns:w10="urn:schemas-microsoft-com:office:word" xmlns:w="http://schemas.openxmlformats.org/wordprocessingml/2006/main" xmlns:w14="http://schemas.microsoft.com/office/word/2010/wordml" xmlns:w15="http://schemas.microsoft.com/office/word/2012/wordml" xmlns:w16cex="http://schemas.microsoft.com/office/word/2018/wordml/cex" xmlns:w16cid="http://schemas.microsoft.com/office/word/2016/wordml/cid" xmlns:w16="http://schemas.microsoft.com/office/word/2018/wordml" xmlns:w16du="http://schemas.microsoft.com/office/word/2023/wordml/word16du" xmlns:w16sdtdh="http://schemas.microsoft.com/office/word/2020/wordml/sdtdatahash" xmlns:w16se="http://schemas.microsoft.com/office/word/2015/wordml/symex" xmlns:wpg="http://schemas.microsoft.com/office/word/2010/wordprocessingGroup" xmlns:wpi="http://schemas.microsoft.com/office/word/2010/wordprocessingInk" xmlns:wne="http://schemas.microsoft.com/office/word/2006/wordml" xmlns:wps="http://schemas.microsoft.com/office/word/2010/wordprocessingShape" mc:Ignorable="w14 w15 w16se w16cid w16 w16cex w16sdtdh w16du wp14">
   <w:body>
     <w:p>
       <w:pPr>
@@ -78,15 +78,7 @@
       </w:r>
       <w:proofErr w:type="spellEnd"/>
       <w:r>
-        <w:t xml:space="preserve">; and he made first the </w:t>
-      </w:r>
-      <w:proofErr w:type="spellStart"/>
-      <w:r>
-        <w:t>Ainur</w:t>
-      </w:r>
-      <w:proofErr w:type="spellEnd"/>
-      <w:r>
-        <w:t>, the Holy Ones, that were the offspring of his thought, and they were with him before aught else was made. And he spoke to them, propounding to them themes of music; and they sang before him, and he was glad</w:t>
+        <w:t>; and he made first the Ainur, the Holy Ones, that were the offspring of his thought, and they were with him before aught else was made. And he spoke to them, propounding to them themes of music; and they sang before him, and he was glad</w:t>
       </w:r>
       <w:r>
         <w:t>”</w:t>
@@ -138,6 +130,459 @@
         <w:t>Tables</w:t>
       </w:r>
       <w:bookmarkEnd w:id="0"/>
+    </w:p>
+    <w:p>
+      <w:pPr>
+        <w:pStyle w:val="TableCaption"/>
+      </w:pPr>
+      <w:r>
+        <w:t xml:space="preserve">Table 1: Table 1 Seed germination cues. Description of the experimental treatments used as proxies of the cues, ecological function of the cue in determining germination phenology, </w:t>
+      </w:r>
+      <w:r>
+        <w:lastRenderedPageBreak/>
+        <w:t>and prediction of the relationship between the cue and the species preferences for stress and disturbance.</w:t>
+      </w:r>
+    </w:p>
+    <w:tbl>
+      <w:tblPr>
+        <w:tblStyle w:val="Table"/>
+        <w:tblW w:w="5000" w:type="pct"/>
+        <w:tblBorders>
+          <w:top w:val="single" w:sz="4" w:space="0" w:color="auto"/>
+          <w:left w:val="single" w:sz="4" w:space="0" w:color="auto"/>
+          <w:bottom w:val="single" w:sz="4" w:space="0" w:color="auto"/>
+          <w:right w:val="single" w:sz="4" w:space="0" w:color="auto"/>
+          <w:insideH w:val="single" w:sz="4" w:space="0" w:color="auto"/>
+          <w:insideV w:val="single" w:sz="4" w:space="0" w:color="auto"/>
+        </w:tblBorders>
+        <w:tblLook w:val="0020" w:firstRow="1" w:lastRow="0" w:firstColumn="0" w:lastColumn="0" w:noHBand="0" w:noVBand="0"/>
+        <w:tblCaption w:val="Table 1: Table 1 Seed germination cues. Description of the experimental treatments used as proxies of the cues, ecological function of the cue in determining germination phenology, and prediction of the relationship between the cue and the species preferences for stress and disturbance."/>
+      </w:tblPr>
+      <w:tblGrid>
+        <w:gridCol w:w="1846"/>
+        <w:gridCol w:w="1690"/>
+        <w:gridCol w:w="1025"/>
+        <w:gridCol w:w="2326"/>
+        <w:gridCol w:w="1941"/>
+      </w:tblGrid>
+      <w:tr>
+        <w:trPr>
+          <w:tblHeader/>
+        </w:trPr>
+        <w:tc>
+          <w:tcPr>
+            <w:tcW w:w="0" w:type="auto"/>
+          </w:tcPr>
+          <w:p>
+            <w:pPr>
+              <w:pStyle w:val="Compact"/>
+            </w:pPr>
+            <w:proofErr w:type="spellStart"/>
+            <w:r>
+              <w:t>Germination.cue</w:t>
+            </w:r>
+            <w:proofErr w:type="spellEnd"/>
+          </w:p>
+        </w:tc>
+        <w:tc>
+          <w:tcPr>
+            <w:tcW w:w="0" w:type="auto"/>
+          </w:tcPr>
+          <w:p>
+            <w:pPr>
+              <w:pStyle w:val="Compact"/>
+            </w:pPr>
+            <w:r>
+              <w:t>Description</w:t>
+            </w:r>
+          </w:p>
+        </w:tc>
+        <w:tc>
+          <w:tcPr>
+            <w:tcW w:w="0" w:type="auto"/>
+          </w:tcPr>
+          <w:p>
+            <w:pPr>
+              <w:pStyle w:val="Compact"/>
+            </w:pPr>
+            <w:r>
+              <w:t>Units</w:t>
+            </w:r>
+          </w:p>
+        </w:tc>
+        <w:tc>
+          <w:tcPr>
+            <w:tcW w:w="0" w:type="auto"/>
+          </w:tcPr>
+          <w:p>
+            <w:pPr>
+              <w:pStyle w:val="Compact"/>
+            </w:pPr>
+            <w:proofErr w:type="spellStart"/>
+            <w:r>
+              <w:t>Ecological.function</w:t>
+            </w:r>
+            <w:proofErr w:type="spellEnd"/>
+          </w:p>
+        </w:tc>
+        <w:tc>
+          <w:tcPr>
+            <w:tcW w:w="0" w:type="auto"/>
+          </w:tcPr>
+          <w:p>
+            <w:pPr>
+              <w:pStyle w:val="Compact"/>
+            </w:pPr>
+            <w:r>
+              <w:t>Prediction</w:t>
+            </w:r>
+          </w:p>
+        </w:tc>
+      </w:tr>
+      <w:tr>
+        <w:tc>
+          <w:tcPr>
+            <w:tcW w:w="0" w:type="auto"/>
+          </w:tcPr>
+          <w:p>
+            <w:pPr>
+              <w:pStyle w:val="Compact"/>
+            </w:pPr>
+            <w:r>
+              <w:t>Scarification</w:t>
+            </w:r>
+          </w:p>
+        </w:tc>
+        <w:tc>
+          <w:tcPr>
+            <w:tcW w:w="0" w:type="auto"/>
+          </w:tcPr>
+          <w:p>
+            <w:pPr>
+              <w:pStyle w:val="Compact"/>
+            </w:pPr>
+            <w:r>
+              <w:t>Abrasion of the seed coat was applied to allow water imbibition</w:t>
+            </w:r>
+          </w:p>
+        </w:tc>
+        <w:tc>
+          <w:tcPr>
+            <w:tcW w:w="0" w:type="auto"/>
+          </w:tcPr>
+          <w:p>
+            <w:pPr>
+              <w:pStyle w:val="Compact"/>
+            </w:pPr>
+            <w:r>
+              <w:t>Binary (yes/no)</w:t>
+            </w:r>
+          </w:p>
+        </w:tc>
+        <w:tc>
+          <w:tcPr>
+            <w:tcW w:w="0" w:type="auto"/>
+          </w:tcPr>
+          <w:p>
+            <w:pPr>
+              <w:pStyle w:val="Compact"/>
+            </w:pPr>
+            <w:r>
+              <w:t>Delay germination until seed coat is abraded by soil movement, fire, freeze-thaw, etc.</w:t>
+            </w:r>
+          </w:p>
+        </w:tc>
+        <w:tc>
+          <w:tcPr>
+            <w:tcW w:w="0" w:type="auto"/>
+          </w:tcPr>
+          <w:p>
+            <w:pPr>
+              <w:pStyle w:val="Compact"/>
+            </w:pPr>
+            <w:r>
+              <w:t>Stronger signal for high-disturbance species (e.g. germinate after soil tilling or fire)</w:t>
+            </w:r>
+          </w:p>
+        </w:tc>
+      </w:tr>
+      <w:tr>
+        <w:tc>
+          <w:tcPr>
+            <w:tcW w:w="0" w:type="auto"/>
+          </w:tcPr>
+          <w:p>
+            <w:pPr>
+              <w:pStyle w:val="Compact"/>
+            </w:pPr>
+            <w:r>
+              <w:t>Cold stratification</w:t>
+            </w:r>
+          </w:p>
+        </w:tc>
+        <w:tc>
+          <w:tcPr>
+            <w:tcW w:w="0" w:type="auto"/>
+          </w:tcPr>
+          <w:p>
+            <w:pPr>
+              <w:pStyle w:val="Compact"/>
+            </w:pPr>
+            <w:r>
+              <w:t>Seeds went through a period (&gt; 4 weeks) of cold-wet stratification (&lt; 6ºC)</w:t>
+            </w:r>
+          </w:p>
+        </w:tc>
+        <w:tc>
+          <w:tcPr>
+            <w:tcW w:w="0" w:type="auto"/>
+          </w:tcPr>
+          <w:p>
+            <w:pPr>
+              <w:pStyle w:val="Compact"/>
+            </w:pPr>
+            <w:r>
+              <w:t>Binary (yes/no)</w:t>
+            </w:r>
+          </w:p>
+        </w:tc>
+        <w:tc>
+          <w:tcPr>
+            <w:tcW w:w="0" w:type="auto"/>
+          </w:tcPr>
+          <w:p>
+            <w:pPr>
+              <w:pStyle w:val="Compact"/>
+            </w:pPr>
+            <w:r>
+              <w:t>Delay germination until a cold season is passed</w:t>
+            </w:r>
+          </w:p>
+        </w:tc>
+        <w:tc>
+          <w:tcPr>
+            <w:tcW w:w="0" w:type="auto"/>
+          </w:tcPr>
+          <w:p>
+            <w:pPr>
+              <w:pStyle w:val="Compact"/>
+            </w:pPr>
+            <w:r>
+              <w:t>Stronger signal for high-stress species (e.g. avoid autumn or winter germination)</w:t>
+            </w:r>
+          </w:p>
+        </w:tc>
+      </w:tr>
+      <w:tr>
+        <w:tc>
+          <w:tcPr>
+            <w:tcW w:w="0" w:type="auto"/>
+          </w:tcPr>
+          <w:p>
+            <w:pPr>
+              <w:pStyle w:val="Compact"/>
+            </w:pPr>
+            <w:r>
+              <w:t>Average temperature</w:t>
+            </w:r>
+          </w:p>
+        </w:tc>
+        <w:tc>
+          <w:tcPr>
+            <w:tcW w:w="0" w:type="auto"/>
+          </w:tcPr>
+          <w:p>
+            <w:pPr>
+              <w:pStyle w:val="Compact"/>
+            </w:pPr>
+            <w:r>
+              <w:t>Weighted average of the diurnal temperature cycle, weighted by the duration of each phase</w:t>
+            </w:r>
+          </w:p>
+        </w:tc>
+        <w:tc>
+          <w:tcPr>
+            <w:tcW w:w="0" w:type="auto"/>
+          </w:tcPr>
+          <w:p>
+            <w:pPr>
+              <w:pStyle w:val="Compact"/>
+            </w:pPr>
+            <w:r>
+              <w:t>ºC</w:t>
+            </w:r>
+          </w:p>
+        </w:tc>
+        <w:tc>
+          <w:tcPr>
+            <w:tcW w:w="0" w:type="auto"/>
+          </w:tcPr>
+          <w:p>
+            <w:pPr>
+              <w:pStyle w:val="Compact"/>
+            </w:pPr>
+            <w:r>
+              <w:t>Delay germination until the proper time of the annual temperature cycle</w:t>
+            </w:r>
+          </w:p>
+        </w:tc>
+        <w:tc>
+          <w:tcPr>
+            <w:tcW w:w="0" w:type="auto"/>
+          </w:tcPr>
+          <w:p>
+            <w:pPr>
+              <w:pStyle w:val="Compact"/>
+            </w:pPr>
+            <w:r>
+              <w:t>Stronger signal for high-stress/low-disturbance species (e.g. summer germination in alpine meadows, mires)</w:t>
+            </w:r>
+          </w:p>
+        </w:tc>
+      </w:tr>
+      <w:tr>
+        <w:tc>
+          <w:tcPr>
+            <w:tcW w:w="0" w:type="auto"/>
+          </w:tcPr>
+          <w:p>
+            <w:pPr>
+              <w:pStyle w:val="Compact"/>
+            </w:pPr>
+            <w:r>
+              <w:t>Alternating temperature</w:t>
+            </w:r>
+          </w:p>
+        </w:tc>
+        <w:tc>
+          <w:tcPr>
+            <w:tcW w:w="0" w:type="auto"/>
+          </w:tcPr>
+          <w:p>
+            <w:pPr>
+              <w:pStyle w:val="Compact"/>
+            </w:pPr>
+            <w:r>
+              <w:t>Different temperatures were applied during the day and night, in diurnal cycles</w:t>
+            </w:r>
+          </w:p>
+        </w:tc>
+        <w:tc>
+          <w:tcPr>
+            <w:tcW w:w="0" w:type="auto"/>
+          </w:tcPr>
+          <w:p>
+            <w:pPr>
+              <w:pStyle w:val="Compact"/>
+            </w:pPr>
+            <w:r>
+              <w:t>Binary (yes/no)</w:t>
+            </w:r>
+          </w:p>
+        </w:tc>
+        <w:tc>
+          <w:tcPr>
+            <w:tcW w:w="0" w:type="auto"/>
+          </w:tcPr>
+          <w:p>
+            <w:pPr>
+              <w:pStyle w:val="Compact"/>
+            </w:pPr>
+            <w:r>
+              <w:t>Delay germination unless close to soil surface, under open vegetation and/or a low water table</w:t>
+            </w:r>
+          </w:p>
+        </w:tc>
+        <w:tc>
+          <w:tcPr>
+            <w:tcW w:w="0" w:type="auto"/>
+          </w:tcPr>
+          <w:p>
+            <w:pPr>
+              <w:pStyle w:val="Compact"/>
+            </w:pPr>
+            <w:r>
+              <w:t>Stronger signal for low-stress/low-disturbance species (e.g. germinate in vegetation gaps)</w:t>
+            </w:r>
+          </w:p>
+        </w:tc>
+      </w:tr>
+      <w:tr>
+        <w:tc>
+          <w:tcPr>
+            <w:tcW w:w="0" w:type="auto"/>
+          </w:tcPr>
+          <w:p>
+            <w:pPr>
+              <w:pStyle w:val="Compact"/>
+            </w:pPr>
+            <w:r>
+              <w:t>Light</w:t>
+            </w:r>
+          </w:p>
+        </w:tc>
+        <w:tc>
+          <w:tcPr>
+            <w:tcW w:w="0" w:type="auto"/>
+          </w:tcPr>
+          <w:p>
+            <w:pPr>
+              <w:pStyle w:val="Compact"/>
+            </w:pPr>
+            <w:r>
+              <w:t>Seeds were exposed to light during some part of the diurnal cycle</w:t>
+            </w:r>
+          </w:p>
+        </w:tc>
+        <w:tc>
+          <w:tcPr>
+            <w:tcW w:w="0" w:type="auto"/>
+          </w:tcPr>
+          <w:p>
+            <w:pPr>
+              <w:pStyle w:val="Compact"/>
+            </w:pPr>
+            <w:r>
+              <w:t>Binary (yes/no)</w:t>
+            </w:r>
+          </w:p>
+        </w:tc>
+        <w:tc>
+          <w:tcPr>
+            <w:tcW w:w="0" w:type="auto"/>
+          </w:tcPr>
+          <w:p>
+            <w:pPr>
+              <w:pStyle w:val="Compact"/>
+            </w:pPr>
+            <w:r>
+              <w:t>Delay germination unless close to soil surface</w:t>
+            </w:r>
+          </w:p>
+        </w:tc>
+        <w:tc>
+          <w:tcPr>
+            <w:tcW w:w="0" w:type="auto"/>
+          </w:tcPr>
+          <w:p>
+            <w:pPr>
+              <w:pStyle w:val="Compact"/>
+            </w:pPr>
+            <w:r>
+              <w:t xml:space="preserve">Stronger signal for low-stress/low-disturbance species </w:t>
+            </w:r>
+            <w:r>
+              <w:lastRenderedPageBreak/>
+              <w:t>(e.g. germinate in vegetation gaps)</w:t>
+            </w:r>
+          </w:p>
+        </w:tc>
+      </w:tr>
+    </w:tbl>
+    <w:p>
+      <w:pPr>
+        <w:pStyle w:val="Textoindependiente"/>
+      </w:pPr>
     </w:p>
     <w:p>
       <w:pPr>
@@ -529,7 +974,6 @@
       </w:pPr>
       <w:bookmarkStart w:id="2" w:name="references"/>
       <w:r>
-        <w:lastRenderedPageBreak/>
         <w:t>References</w:t>
       </w:r>
       <w:bookmarkEnd w:id="2"/>
@@ -608,7 +1052,7 @@
 </file>
 
 <file path=word/endnotes.xml><?xml version="1.0" encoding="utf-8"?>
-<w:endnotes xmlns:wpc="http://schemas.microsoft.com/office/word/2010/wordprocessingCanvas" xmlns:cx="http://schemas.microsoft.com/office/drawing/2014/chartex" xmlns:cx1="http://schemas.microsoft.com/office/drawing/2015/9/8/chartex" xmlns:cx2="http://schemas.microsoft.com/office/drawing/2015/10/21/chartex" xmlns:cx3="http://schemas.microsoft.com/office/drawing/2016/5/9/chartex" xmlns:cx4="http://schemas.microsoft.com/office/drawing/2016/5/10/chartex" xmlns:cx5="http://schemas.microsoft.com/office/drawing/2016/5/11/chartex" xmlns:cx6="http://schemas.microsoft.com/office/drawing/2016/5/12/chartex" xmlns:cx7="http://schemas.microsoft.com/office/drawing/2016/5/13/chartex" xmlns:cx8="http://schemas.microsoft.com/office/drawing/2016/5/14/chartex" xmlns:mc="http://schemas.openxmlformats.org/markup-compatibility/2006" xmlns:aink="http://schemas.microsoft.com/office/drawing/2016/ink" xmlns:am3d="http://schemas.microsoft.com/office/drawing/2017/model3d" xmlns:o="urn:schemas-microsoft-com:office:office" xmlns:r="http://schemas.openxmlformats.org/officeDocument/2006/relationships" xmlns:m="http://schemas.openxmlformats.org/officeDocument/2006/math" xmlns:v="urn:schemas-microsoft-com:vml" xmlns:wp14="http://schemas.microsoft.com/office/word/2010/wordprocessingDrawing" xmlns:wp="http://schemas.openxmlformats.org/drawingml/2006/wordprocessingDrawing" xmlns:w10="urn:schemas-microsoft-com:office:word" xmlns:w="http://schemas.openxmlformats.org/wordprocessingml/2006/main" xmlns:w14="http://schemas.microsoft.com/office/word/2010/wordml" xmlns:w15="http://schemas.microsoft.com/office/word/2012/wordml" xmlns:w16cex="http://schemas.microsoft.com/office/word/2018/wordml/cex" xmlns:w16cid="http://schemas.microsoft.com/office/word/2016/wordml/cid" xmlns:w16="http://schemas.microsoft.com/office/word/2018/wordml" xmlns:w16sdtdh="http://schemas.microsoft.com/office/word/2020/wordml/sdtdatahash" xmlns:w16se="http://schemas.microsoft.com/office/word/2015/wordml/symex" xmlns:wpg="http://schemas.microsoft.com/office/word/2010/wordprocessingGroup" xmlns:wpi="http://schemas.microsoft.com/office/word/2010/wordprocessingInk" xmlns:wne="http://schemas.microsoft.com/office/word/2006/wordml" xmlns:wps="http://schemas.microsoft.com/office/word/2010/wordprocessingShape" mc:Ignorable="w14 w15 w16se w16cid w16 w16cex w16sdtdh wp14">
+<w:endnotes xmlns:wpc="http://schemas.microsoft.com/office/word/2010/wordprocessingCanvas" xmlns:cx="http://schemas.microsoft.com/office/drawing/2014/chartex" xmlns:cx1="http://schemas.microsoft.com/office/drawing/2015/9/8/chartex" xmlns:cx2="http://schemas.microsoft.com/office/drawing/2015/10/21/chartex" xmlns:cx3="http://schemas.microsoft.com/office/drawing/2016/5/9/chartex" xmlns:cx4="http://schemas.microsoft.com/office/drawing/2016/5/10/chartex" xmlns:cx5="http://schemas.microsoft.com/office/drawing/2016/5/11/chartex" xmlns:cx6="http://schemas.microsoft.com/office/drawing/2016/5/12/chartex" xmlns:cx7="http://schemas.microsoft.com/office/drawing/2016/5/13/chartex" xmlns:cx8="http://schemas.microsoft.com/office/drawing/2016/5/14/chartex" xmlns:mc="http://schemas.openxmlformats.org/markup-compatibility/2006" xmlns:aink="http://schemas.microsoft.com/office/drawing/2016/ink" xmlns:am3d="http://schemas.microsoft.com/office/drawing/2017/model3d" xmlns:o="urn:schemas-microsoft-com:office:office" xmlns:oel="http://schemas.microsoft.com/office/2019/extlst" xmlns:r="http://schemas.openxmlformats.org/officeDocument/2006/relationships" xmlns:m="http://schemas.openxmlformats.org/officeDocument/2006/math" xmlns:v="urn:schemas-microsoft-com:vml" xmlns:wp14="http://schemas.microsoft.com/office/word/2010/wordprocessingDrawing" xmlns:wp="http://schemas.openxmlformats.org/drawingml/2006/wordprocessingDrawing" xmlns:w10="urn:schemas-microsoft-com:office:word" xmlns:w="http://schemas.openxmlformats.org/wordprocessingml/2006/main" xmlns:w14="http://schemas.microsoft.com/office/word/2010/wordml" xmlns:w15="http://schemas.microsoft.com/office/word/2012/wordml" xmlns:w16cex="http://schemas.microsoft.com/office/word/2018/wordml/cex" xmlns:w16cid="http://schemas.microsoft.com/office/word/2016/wordml/cid" xmlns:w16="http://schemas.microsoft.com/office/word/2018/wordml" xmlns:w16du="http://schemas.microsoft.com/office/word/2023/wordml/word16du" xmlns:w16sdtdh="http://schemas.microsoft.com/office/word/2020/wordml/sdtdatahash" xmlns:w16se="http://schemas.microsoft.com/office/word/2015/wordml/symex" xmlns:wpg="http://schemas.microsoft.com/office/word/2010/wordprocessingGroup" xmlns:wpi="http://schemas.microsoft.com/office/word/2010/wordprocessingInk" xmlns:wne="http://schemas.microsoft.com/office/word/2006/wordml" xmlns:wps="http://schemas.microsoft.com/office/word/2010/wordprocessingShape" mc:Ignorable="w14 w15 w16se w16cid w16 w16cex w16sdtdh w16du wp14">
   <w:endnote w:type="separator" w:id="-1">
     <w:p>
       <w:pPr>
@@ -633,7 +1077,7 @@
 </file>
 
 <file path=word/footer1.xml><?xml version="1.0" encoding="utf-8"?>
-<w:ftr xmlns:wpc="http://schemas.microsoft.com/office/word/2010/wordprocessingCanvas" xmlns:cx="http://schemas.microsoft.com/office/drawing/2014/chartex" xmlns:cx1="http://schemas.microsoft.com/office/drawing/2015/9/8/chartex" xmlns:cx2="http://schemas.microsoft.com/office/drawing/2015/10/21/chartex" xmlns:cx3="http://schemas.microsoft.com/office/drawing/2016/5/9/chartex" xmlns:cx4="http://schemas.microsoft.com/office/drawing/2016/5/10/chartex" xmlns:cx5="http://schemas.microsoft.com/office/drawing/2016/5/11/chartex" xmlns:cx6="http://schemas.microsoft.com/office/drawing/2016/5/12/chartex" xmlns:cx7="http://schemas.microsoft.com/office/drawing/2016/5/13/chartex" xmlns:cx8="http://schemas.microsoft.com/office/drawing/2016/5/14/chartex" xmlns:mc="http://schemas.openxmlformats.org/markup-compatibility/2006" xmlns:aink="http://schemas.microsoft.com/office/drawing/2016/ink" xmlns:am3d="http://schemas.microsoft.com/office/drawing/2017/model3d" xmlns:o="urn:schemas-microsoft-com:office:office" xmlns:r="http://schemas.openxmlformats.org/officeDocument/2006/relationships" xmlns:m="http://schemas.openxmlformats.org/officeDocument/2006/math" xmlns:v="urn:schemas-microsoft-com:vml" xmlns:wp14="http://schemas.microsoft.com/office/word/2010/wordprocessingDrawing" xmlns:wp="http://schemas.openxmlformats.org/drawingml/2006/wordprocessingDrawing" xmlns:w10="urn:schemas-microsoft-com:office:word" xmlns:w="http://schemas.openxmlformats.org/wordprocessingml/2006/main" xmlns:w14="http://schemas.microsoft.com/office/word/2010/wordml" xmlns:w15="http://schemas.microsoft.com/office/word/2012/wordml" xmlns:w16cex="http://schemas.microsoft.com/office/word/2018/wordml/cex" xmlns:w16cid="http://schemas.microsoft.com/office/word/2016/wordml/cid" xmlns:w16="http://schemas.microsoft.com/office/word/2018/wordml" xmlns:w16sdtdh="http://schemas.microsoft.com/office/word/2020/wordml/sdtdatahash" xmlns:w16se="http://schemas.microsoft.com/office/word/2015/wordml/symex" xmlns:wpg="http://schemas.microsoft.com/office/word/2010/wordprocessingGroup" xmlns:wpi="http://schemas.microsoft.com/office/word/2010/wordprocessingInk" xmlns:wne="http://schemas.microsoft.com/office/word/2006/wordml" xmlns:wps="http://schemas.microsoft.com/office/word/2010/wordprocessingShape" mc:Ignorable="w14 w15 w16se w16cid w16 w16cex w16sdtdh wp14">
+<w:ftr xmlns:wpc="http://schemas.microsoft.com/office/word/2010/wordprocessingCanvas" xmlns:cx="http://schemas.microsoft.com/office/drawing/2014/chartex" xmlns:cx1="http://schemas.microsoft.com/office/drawing/2015/9/8/chartex" xmlns:cx2="http://schemas.microsoft.com/office/drawing/2015/10/21/chartex" xmlns:cx3="http://schemas.microsoft.com/office/drawing/2016/5/9/chartex" xmlns:cx4="http://schemas.microsoft.com/office/drawing/2016/5/10/chartex" xmlns:cx5="http://schemas.microsoft.com/office/drawing/2016/5/11/chartex" xmlns:cx6="http://schemas.microsoft.com/office/drawing/2016/5/12/chartex" xmlns:cx7="http://schemas.microsoft.com/office/drawing/2016/5/13/chartex" xmlns:cx8="http://schemas.microsoft.com/office/drawing/2016/5/14/chartex" xmlns:mc="http://schemas.openxmlformats.org/markup-compatibility/2006" xmlns:aink="http://schemas.microsoft.com/office/drawing/2016/ink" xmlns:am3d="http://schemas.microsoft.com/office/drawing/2017/model3d" xmlns:o="urn:schemas-microsoft-com:office:office" xmlns:oel="http://schemas.microsoft.com/office/2019/extlst" xmlns:r="http://schemas.openxmlformats.org/officeDocument/2006/relationships" xmlns:m="http://schemas.openxmlformats.org/officeDocument/2006/math" xmlns:v="urn:schemas-microsoft-com:vml" xmlns:wp14="http://schemas.microsoft.com/office/word/2010/wordprocessingDrawing" xmlns:wp="http://schemas.openxmlformats.org/drawingml/2006/wordprocessingDrawing" xmlns:w10="urn:schemas-microsoft-com:office:word" xmlns:w="http://schemas.openxmlformats.org/wordprocessingml/2006/main" xmlns:w14="http://schemas.microsoft.com/office/word/2010/wordml" xmlns:w15="http://schemas.microsoft.com/office/word/2012/wordml" xmlns:w16cex="http://schemas.microsoft.com/office/word/2018/wordml/cex" xmlns:w16cid="http://schemas.microsoft.com/office/word/2016/wordml/cid" xmlns:w16="http://schemas.microsoft.com/office/word/2018/wordml" xmlns:w16du="http://schemas.microsoft.com/office/word/2023/wordml/word16du" xmlns:w16sdtdh="http://schemas.microsoft.com/office/word/2020/wordml/sdtdatahash" xmlns:w16se="http://schemas.microsoft.com/office/word/2015/wordml/symex" xmlns:wpg="http://schemas.microsoft.com/office/word/2010/wordprocessingGroup" xmlns:wpi="http://schemas.microsoft.com/office/word/2010/wordprocessingInk" xmlns:wne="http://schemas.microsoft.com/office/word/2006/wordml" xmlns:wps="http://schemas.microsoft.com/office/word/2010/wordprocessingShape" mc:Ignorable="w14 w15 w16se w16cid w16 w16cex w16sdtdh w16du wp14">
   <w:sdt>
     <w:sdtPr>
       <w:id w:val="301898836"/>
@@ -679,7 +1123,7 @@
 </file>
 
 <file path=word/footnotes.xml><?xml version="1.0" encoding="utf-8"?>
-<w:footnotes xmlns:wpc="http://schemas.microsoft.com/office/word/2010/wordprocessingCanvas" xmlns:cx="http://schemas.microsoft.com/office/drawing/2014/chartex" xmlns:cx1="http://schemas.microsoft.com/office/drawing/2015/9/8/chartex" xmlns:cx2="http://schemas.microsoft.com/office/drawing/2015/10/21/chartex" xmlns:cx3="http://schemas.microsoft.com/office/drawing/2016/5/9/chartex" xmlns:cx4="http://schemas.microsoft.com/office/drawing/2016/5/10/chartex" xmlns:cx5="http://schemas.microsoft.com/office/drawing/2016/5/11/chartex" xmlns:cx6="http://schemas.microsoft.com/office/drawing/2016/5/12/chartex" xmlns:cx7="http://schemas.microsoft.com/office/drawing/2016/5/13/chartex" xmlns:cx8="http://schemas.microsoft.com/office/drawing/2016/5/14/chartex" xmlns:mc="http://schemas.openxmlformats.org/markup-compatibility/2006" xmlns:aink="http://schemas.microsoft.com/office/drawing/2016/ink" xmlns:am3d="http://schemas.microsoft.com/office/drawing/2017/model3d" xmlns:o="urn:schemas-microsoft-com:office:office" xmlns:r="http://schemas.openxmlformats.org/officeDocument/2006/relationships" xmlns:m="http://schemas.openxmlformats.org/officeDocument/2006/math" xmlns:v="urn:schemas-microsoft-com:vml" xmlns:wp14="http://schemas.microsoft.com/office/word/2010/wordprocessingDrawing" xmlns:wp="http://schemas.openxmlformats.org/drawingml/2006/wordprocessingDrawing" xmlns:w10="urn:schemas-microsoft-com:office:word" xmlns:w="http://schemas.openxmlformats.org/wordprocessingml/2006/main" xmlns:w14="http://schemas.microsoft.com/office/word/2010/wordml" xmlns:w15="http://schemas.microsoft.com/office/word/2012/wordml" xmlns:w16cex="http://schemas.microsoft.com/office/word/2018/wordml/cex" xmlns:w16cid="http://schemas.microsoft.com/office/word/2016/wordml/cid" xmlns:w16="http://schemas.microsoft.com/office/word/2018/wordml" xmlns:w16sdtdh="http://schemas.microsoft.com/office/word/2020/wordml/sdtdatahash" xmlns:w16se="http://schemas.microsoft.com/office/word/2015/wordml/symex" xmlns:wpg="http://schemas.microsoft.com/office/word/2010/wordprocessingGroup" xmlns:wpi="http://schemas.microsoft.com/office/word/2010/wordprocessingInk" xmlns:wne="http://schemas.microsoft.com/office/word/2006/wordml" xmlns:wps="http://schemas.microsoft.com/office/word/2010/wordprocessingShape" mc:Ignorable="w14 w15 w16se w16cid w16 w16cex w16sdtdh wp14">
+<w:footnotes xmlns:wpc="http://schemas.microsoft.com/office/word/2010/wordprocessingCanvas" xmlns:cx="http://schemas.microsoft.com/office/drawing/2014/chartex" xmlns:cx1="http://schemas.microsoft.com/office/drawing/2015/9/8/chartex" xmlns:cx2="http://schemas.microsoft.com/office/drawing/2015/10/21/chartex" xmlns:cx3="http://schemas.microsoft.com/office/drawing/2016/5/9/chartex" xmlns:cx4="http://schemas.microsoft.com/office/drawing/2016/5/10/chartex" xmlns:cx5="http://schemas.microsoft.com/office/drawing/2016/5/11/chartex" xmlns:cx6="http://schemas.microsoft.com/office/drawing/2016/5/12/chartex" xmlns:cx7="http://schemas.microsoft.com/office/drawing/2016/5/13/chartex" xmlns:cx8="http://schemas.microsoft.com/office/drawing/2016/5/14/chartex" xmlns:mc="http://schemas.openxmlformats.org/markup-compatibility/2006" xmlns:aink="http://schemas.microsoft.com/office/drawing/2016/ink" xmlns:am3d="http://schemas.microsoft.com/office/drawing/2017/model3d" xmlns:o="urn:schemas-microsoft-com:office:office" xmlns:oel="http://schemas.microsoft.com/office/2019/extlst" xmlns:r="http://schemas.openxmlformats.org/officeDocument/2006/relationships" xmlns:m="http://schemas.openxmlformats.org/officeDocument/2006/math" xmlns:v="urn:schemas-microsoft-com:vml" xmlns:wp14="http://schemas.microsoft.com/office/word/2010/wordprocessingDrawing" xmlns:wp="http://schemas.openxmlformats.org/drawingml/2006/wordprocessingDrawing" xmlns:w10="urn:schemas-microsoft-com:office:word" xmlns:w="http://schemas.openxmlformats.org/wordprocessingml/2006/main" xmlns:w14="http://schemas.microsoft.com/office/word/2010/wordml" xmlns:w15="http://schemas.microsoft.com/office/word/2012/wordml" xmlns:w16cex="http://schemas.microsoft.com/office/word/2018/wordml/cex" xmlns:w16cid="http://schemas.microsoft.com/office/word/2016/wordml/cid" xmlns:w16="http://schemas.microsoft.com/office/word/2018/wordml" xmlns:w16du="http://schemas.microsoft.com/office/word/2023/wordml/word16du" xmlns:w16sdtdh="http://schemas.microsoft.com/office/word/2020/wordml/sdtdatahash" xmlns:w16se="http://schemas.microsoft.com/office/word/2015/wordml/symex" xmlns:wpg="http://schemas.microsoft.com/office/word/2010/wordprocessingGroup" xmlns:wpi="http://schemas.microsoft.com/office/word/2010/wordprocessingInk" xmlns:wne="http://schemas.microsoft.com/office/word/2006/wordml" xmlns:wps="http://schemas.microsoft.com/office/word/2010/wordprocessingShape" mc:Ignorable="w14 w15 w16se w16cid w16 w16cex w16sdtdh w16du wp14">
   <w:footnote w:type="separator" w:id="-1">
     <w:p>
       <w:r>
@@ -698,7 +1142,7 @@
 </file>
 
 <file path=word/numbering.xml><?xml version="1.0" encoding="utf-8"?>
-<w:numbering xmlns:wpc="http://schemas.microsoft.com/office/word/2010/wordprocessingCanvas" xmlns:cx="http://schemas.microsoft.com/office/drawing/2014/chartex" xmlns:cx1="http://schemas.microsoft.com/office/drawing/2015/9/8/chartex" xmlns:cx2="http://schemas.microsoft.com/office/drawing/2015/10/21/chartex" xmlns:cx3="http://schemas.microsoft.com/office/drawing/2016/5/9/chartex" xmlns:cx4="http://schemas.microsoft.com/office/drawing/2016/5/10/chartex" xmlns:cx5="http://schemas.microsoft.com/office/drawing/2016/5/11/chartex" xmlns:cx6="http://schemas.microsoft.com/office/drawing/2016/5/12/chartex" xmlns:cx7="http://schemas.microsoft.com/office/drawing/2016/5/13/chartex" xmlns:cx8="http://schemas.microsoft.com/office/drawing/2016/5/14/chartex" xmlns:mc="http://schemas.openxmlformats.org/markup-compatibility/2006" xmlns:aink="http://schemas.microsoft.com/office/drawing/2016/ink" xmlns:am3d="http://schemas.microsoft.com/office/drawing/2017/model3d" xmlns:o="urn:schemas-microsoft-com:office:office" xmlns:r="http://schemas.openxmlformats.org/officeDocument/2006/relationships" xmlns:m="http://schemas.openxmlformats.org/officeDocument/2006/math" xmlns:v="urn:schemas-microsoft-com:vml" xmlns:wp14="http://schemas.microsoft.com/office/word/2010/wordprocessingDrawing" xmlns:wp="http://schemas.openxmlformats.org/drawingml/2006/wordprocessingDrawing" xmlns:w10="urn:schemas-microsoft-com:office:word" xmlns:w="http://schemas.openxmlformats.org/wordprocessingml/2006/main" xmlns:w14="http://schemas.microsoft.com/office/word/2010/wordml" xmlns:w15="http://schemas.microsoft.com/office/word/2012/wordml" xmlns:w16cex="http://schemas.microsoft.com/office/word/2018/wordml/cex" xmlns:w16cid="http://schemas.microsoft.com/office/word/2016/wordml/cid" xmlns:w16="http://schemas.microsoft.com/office/word/2018/wordml" xmlns:w16sdtdh="http://schemas.microsoft.com/office/word/2020/wordml/sdtdatahash" xmlns:w16se="http://schemas.microsoft.com/office/word/2015/wordml/symex" xmlns:wpg="http://schemas.microsoft.com/office/word/2010/wordprocessingGroup" xmlns:wpi="http://schemas.microsoft.com/office/word/2010/wordprocessingInk" xmlns:wne="http://schemas.microsoft.com/office/word/2006/wordml" xmlns:wps="http://schemas.microsoft.com/office/word/2010/wordprocessingShape" mc:Ignorable="w14 w15 w16se w16cid w16 w16cex w16sdtdh wp14">
+<w:numbering xmlns:wpc="http://schemas.microsoft.com/office/word/2010/wordprocessingCanvas" xmlns:cx="http://schemas.microsoft.com/office/drawing/2014/chartex" xmlns:cx1="http://schemas.microsoft.com/office/drawing/2015/9/8/chartex" xmlns:cx2="http://schemas.microsoft.com/office/drawing/2015/10/21/chartex" xmlns:cx3="http://schemas.microsoft.com/office/drawing/2016/5/9/chartex" xmlns:cx4="http://schemas.microsoft.com/office/drawing/2016/5/10/chartex" xmlns:cx5="http://schemas.microsoft.com/office/drawing/2016/5/11/chartex" xmlns:cx6="http://schemas.microsoft.com/office/drawing/2016/5/12/chartex" xmlns:cx7="http://schemas.microsoft.com/office/drawing/2016/5/13/chartex" xmlns:cx8="http://schemas.microsoft.com/office/drawing/2016/5/14/chartex" xmlns:mc="http://schemas.openxmlformats.org/markup-compatibility/2006" xmlns:aink="http://schemas.microsoft.com/office/drawing/2016/ink" xmlns:am3d="http://schemas.microsoft.com/office/drawing/2017/model3d" xmlns:o="urn:schemas-microsoft-com:office:office" xmlns:oel="http://schemas.microsoft.com/office/2019/extlst" xmlns:r="http://schemas.openxmlformats.org/officeDocument/2006/relationships" xmlns:m="http://schemas.openxmlformats.org/officeDocument/2006/math" xmlns:v="urn:schemas-microsoft-com:vml" xmlns:wp14="http://schemas.microsoft.com/office/word/2010/wordprocessingDrawing" xmlns:wp="http://schemas.openxmlformats.org/drawingml/2006/wordprocessingDrawing" xmlns:w10="urn:schemas-microsoft-com:office:word" xmlns:w="http://schemas.openxmlformats.org/wordprocessingml/2006/main" xmlns:w14="http://schemas.microsoft.com/office/word/2010/wordml" xmlns:w15="http://schemas.microsoft.com/office/word/2012/wordml" xmlns:w16cex="http://schemas.microsoft.com/office/word/2018/wordml/cex" xmlns:w16cid="http://schemas.microsoft.com/office/word/2016/wordml/cid" xmlns:w16="http://schemas.microsoft.com/office/word/2018/wordml" xmlns:w16du="http://schemas.microsoft.com/office/word/2023/wordml/word16du" xmlns:w16sdtdh="http://schemas.microsoft.com/office/word/2020/wordml/sdtdatahash" xmlns:w16se="http://schemas.microsoft.com/office/word/2015/wordml/symex" xmlns:wpg="http://schemas.microsoft.com/office/word/2010/wordprocessingGroup" xmlns:wpi="http://schemas.microsoft.com/office/word/2010/wordprocessingInk" xmlns:wne="http://schemas.microsoft.com/office/word/2006/wordml" xmlns:wps="http://schemas.microsoft.com/office/word/2010/wordprocessingShape" mc:Ignorable="w14 w15 w16se w16cid w16 w16cex w16sdtdh w16du wp14">
   <w:abstractNum w:abstractNumId="0" w15:restartNumberingAfterBreak="0">
     <w:nsid w:val="EA454B4C"/>
     <w:multiLevelType w:val="multilevel"/>
@@ -907,20 +1351,20 @@
       </w:pPr>
     </w:lvl>
   </w:abstractNum>
-  <w:num w:numId="1">
+  <w:num w:numId="1" w16cid:durableId="928807865">
     <w:abstractNumId w:val="1"/>
   </w:num>
-  <w:num w:numId="2">
+  <w:num w:numId="2" w16cid:durableId="1537352192">
     <w:abstractNumId w:val="0"/>
   </w:num>
-  <w:num w:numId="3">
+  <w:num w:numId="3" w16cid:durableId="1522746871">
     <w:abstractNumId w:val="1"/>
   </w:num>
 </w:numbering>
 </file>
 
 <file path=word/styles.xml><?xml version="1.0" encoding="utf-8"?>
-<w:styles xmlns:mc="http://schemas.openxmlformats.org/markup-compatibility/2006" xmlns:r="http://schemas.openxmlformats.org/officeDocument/2006/relationships" xmlns:w="http://schemas.openxmlformats.org/wordprocessingml/2006/main" xmlns:w14="http://schemas.microsoft.com/office/word/2010/wordml" xmlns:w15="http://schemas.microsoft.com/office/word/2012/wordml" xmlns:w16cex="http://schemas.microsoft.com/office/word/2018/wordml/cex" xmlns:w16cid="http://schemas.microsoft.com/office/word/2016/wordml/cid" xmlns:w16="http://schemas.microsoft.com/office/word/2018/wordml" xmlns:w16sdtdh="http://schemas.microsoft.com/office/word/2020/wordml/sdtdatahash" xmlns:w16se="http://schemas.microsoft.com/office/word/2015/wordml/symex" mc:Ignorable="w14 w15 w16se w16cid w16 w16cex w16sdtdh">
+<w:styles xmlns:mc="http://schemas.openxmlformats.org/markup-compatibility/2006" xmlns:r="http://schemas.openxmlformats.org/officeDocument/2006/relationships" xmlns:w="http://schemas.openxmlformats.org/wordprocessingml/2006/main" xmlns:w14="http://schemas.microsoft.com/office/word/2010/wordml" xmlns:w15="http://schemas.microsoft.com/office/word/2012/wordml" xmlns:w16cex="http://schemas.microsoft.com/office/word/2018/wordml/cex" xmlns:w16cid="http://schemas.microsoft.com/office/word/2016/wordml/cid" xmlns:w16="http://schemas.microsoft.com/office/word/2018/wordml" xmlns:w16du="http://schemas.microsoft.com/office/word/2023/wordml/word16du" xmlns:w16sdtdh="http://schemas.microsoft.com/office/word/2020/wordml/sdtdatahash" xmlns:w16se="http://schemas.microsoft.com/office/word/2015/wordml/symex" mc:Ignorable="w14 w15 w16se w16cid w16 w16cex w16sdtdh w16du">
   <w:docDefaults>
     <w:rPrDefault>
       <w:rPr>
@@ -1494,9 +1938,14 @@
     <w:name w:val="Compact"/>
     <w:basedOn w:val="Textoindependiente"/>
     <w:qFormat/>
+    <w:rsid w:val="00A36E5A"/>
     <w:pPr>
-      <w:spacing w:before="36" w:after="36"/>
+      <w:spacing w:before="0" w:after="120" w:line="240" w:lineRule="auto"/>
+      <w:jc w:val="left"/>
     </w:pPr>
+    <w:rPr>
+      <w:rFonts w:cs="Times New Roman"/>
+    </w:rPr>
   </w:style>
   <w:style w:type="paragraph" w:styleId="Ttulo">
     <w:name w:val="Title"/>

</xml_diff>